<commit_message>
Briefs: attribute Oct 31 missile decisions to Japan's record; add U.S. readout
Independent review of the October 31 draft found that both missile
decisions (AMRAAM final assembly and check-out, SM-3 Block IIA
information sharing) appear only in Japan MOD's records. The U.S.
Department of War readout mentions neither. P1 now says so and cites
the readout as new reference s8, which also supplies Hegseth's full name.

Japanese originals of s2 and s6 were compared and match the article.
DOCX, draft sidecar, references and presentation fingerprint were
regenerated together; docket, change report and email draft updated.
Status stays unapproved and unnumbered.

Co-Authored-By: Claude Opus 5.5 <noreply@anthropic.com>
</commit_message>
<xml_diff>
--- a/research/briefs/manual_2026-10-31_japan_us_missile_agreement_manuscript.docx
+++ b/research/briefs/manual_2026-10-31_japan_us_missile_agreement_manuscript.docx
@@ -36,7 +36,7 @@
     </w:p>
     <w:p>
       <w:r>
-        <w:t xml:space="preserve">Japan’s defense minister, Koizumi Shinjiro, and U.S. Secretary of War Hegseth agreed on 28 October to establish a facility in Japan for the final assembly and check-out of the AIM-120 Advanced Medium-Range Air-to-Air Missile (AMRAAM). They met for about 30 minutes in the Philippines, where both were attending the ASEAN Defence Ministers’ Meeting-Plus (ADMM-Plus). According to </w:t>
+        <w:t xml:space="preserve">Japan’s defense minister, Koizumi Shinjiro, and U.S. Secretary of War Pete Hegseth agreed on 28 October to establish a facility in Japan for the final assembly and check-out of the AIM-120 Advanced Medium-Range Air-to-Air Missile (AMRAAM). They met for about 30 minutes in the Philippines, where both were attending the ASEAN Defence Ministers’ Meeting-Plus (ADMM-Plus). According to </w:t>
       </w:r>
       <w:hyperlink r:id="rId10">
         <w:r>
@@ -58,7 +58,18 @@
         </w:r>
       </w:hyperlink>
       <w:r>
-        <w:t xml:space="preserve"> records the first decision as agreement on establishing (設置) a final assembly and inspection (最終組立・検査) facility inside Japan.</w:t>
+        <w:t xml:space="preserve"> records the first decision as agreement on establishing (設置) a final assembly and inspection (最終組立・検査) facility inside Japan. </w:t>
+      </w:r>
+      <w:hyperlink r:id="rId12">
+        <w:r>
+          <w:rPr>
+            <w:rStyle w:val="Hyperlink"/>
+          </w:rPr>
+          <w:t xml:space="preserve">The U.S. Department of War’s readout</w:t>
+        </w:r>
+      </w:hyperlink>
+      <w:r>
+        <w:t xml:space="preserve"> of the meeting mentions neither decision. It says only that the two ministers committed to continue close coordination on critical munitions production.</w:t>
       </w:r>
     </w:p>
     <w:p>
@@ -89,7 +100,7 @@
       <w:r>
         <w:t xml:space="preserve">October’s decision closes a question the allies left open in April. At the fourth plenary of their Defense Industrial Cooperation, Acquisition, and Sustainment forum (DICAS), held in Washington on 14 April, </w:t>
       </w:r>
-      <w:hyperlink r:id="rId12">
+      <w:hyperlink r:id="rId13">
         <w:r>
           <w:rPr>
             <w:rStyle w:val="Hyperlink"/>
@@ -105,27 +116,27 @@
       <w:r>
         <w:t xml:space="preserve">Two weeks later, </w:t>
       </w:r>
+      <w:hyperlink r:id="rId14">
+        <w:r>
+          <w:rPr>
+            <w:rStyle w:val="Hyperlink"/>
+          </w:rPr>
+          <w:t xml:space="preserve">Mitsubishi Electric said</w:t>
+        </w:r>
+      </w:hyperlink>
+      <w:r>
+        <w:t xml:space="preserve"> it would move forward discussions with Raytheon and other industry partners on the scope of Japan’s participation, including circuit-card work and “the possibility of a future” final assembly and check-out in Japan. The company said it had been studying whether it could contribute to AMRAAM production under defense ministry contracts awarded in 2024 and 2025. It did not present itself as the future assembler.</w:t>
+      </w:r>
+    </w:p>
+    <w:p>
+      <w:r>
+        <w:t xml:space="preserve">The SM-3 item continues an existing effort rather than starting a new one. In April the allies confirmed </w:t>
+      </w:r>
       <w:hyperlink r:id="rId13">
         <w:r>
           <w:rPr>
             <w:rStyle w:val="Hyperlink"/>
           </w:rPr>
-          <w:t xml:space="preserve">Mitsubishi Electric said</w:t>
-        </w:r>
-      </w:hyperlink>
-      <w:r>
-        <w:t xml:space="preserve"> it would move forward discussions with Raytheon and other industry partners on the scope of Japan’s participation, including circuit-card work and “the possibility of a future” final assembly and check-out in Japan. The company said it had been studying whether it could contribute to AMRAAM production under defense ministry contracts awarded in 2024 and 2025. It did not present itself as the future assembler.</w:t>
-      </w:r>
-    </w:p>
-    <w:p>
-      <w:r>
-        <w:t xml:space="preserve">The SM-3 item continues an existing effort rather than starting a new one. In April the allies confirmed </w:t>
-      </w:r>
-      <w:hyperlink r:id="rId12">
-        <w:r>
-          <w:rPr>
-            <w:rStyle w:val="Hyperlink"/>
-          </w:rPr>
           <w:t xml:space="preserve">concrete measures to raise SM-3 Block IIA production roughly fourfold</w:t>
         </w:r>
       </w:hyperlink>
@@ -145,7 +156,7 @@
       <w:r>
         <w:t xml:space="preserve">The AMRAAM decision is more consequential. </w:t>
       </w:r>
-      <w:hyperlink r:id="rId12">
+      <w:hyperlink r:id="rId13">
         <w:r>
           <w:rPr>
             <w:rStyle w:val="Hyperlink"/>
@@ -185,7 +196,7 @@
       <w:r>
         <w:t xml:space="preserve">On the same day, Koizumi and the Philippine Secretary of National Defense, Gilberto C. Teodoro Jr., issued </w:t>
       </w:r>
-      <w:hyperlink r:id="rId14">
+      <w:hyperlink r:id="rId15">
         <w:r>
           <w:rPr>
             <w:rStyle w:val="Hyperlink"/>
@@ -196,69 +207,69 @@
       <w:r>
         <w:t xml:space="preserve"> on Japan’s Abukuma-class destroyers. Their defense authorities concurred in aiming to transfer the first ship “at the earliest possible date” after its expected decommissioning “in the coming years,” to train Philippine Navy personnel before the transfer and to cooperate on maintenance. Each government is now to carry out the necessary internal coordination. The statement also kept a goal of transferring one TC-90 aircraft by the end of Japan’s fiscal year 2027. </w:t>
       </w:r>
+      <w:hyperlink r:id="rId16">
+        <w:r>
+          <w:rPr>
+            <w:rStyle w:val="Hyperlink"/>
+          </w:rPr>
+          <w:t xml:space="preserve">The Japanese-language text</w:t>
+        </w:r>
+      </w:hyperlink>
+      <w:r>
+        <w:t xml:space="preserve"> is more guarded than the English: it presents the destroyer aim as a matter on which the two sides will continue consultations (協議を継続).</w:t>
+      </w:r>
+    </w:p>
+    <w:p>
+      <w:r>
+        <w:t xml:space="preserve">Much of this predates the week. When the two ministers met in Singapore on 31 May, they </w:t>
+      </w:r>
+      <w:hyperlink r:id="rId17">
+        <w:r>
+          <w:rPr>
+            <w:rStyle w:val="Hyperlink"/>
+          </w:rPr>
+          <w:t xml:space="preserve">reached a broad consensus</w:t>
+        </w:r>
+      </w:hyperlink>
+      <w:r>
+        <w:t xml:space="preserve"> to proceed with discussions toward transferring the destroyers promptly after decommissioning and one TC-90 within fiscal 2027, with training and maintenance to be worked out in a working group formed on 5 May. October’s increment is a stated aim for the first ship, training that begins before the handover and a move to coordination inside each government. No destroyer has been decommissioned or transferred. The Philippine arrangement and the missile decisions came on the same trip, but the published summaries do not link them.</w:t>
+      </w:r>
+    </w:p>
+    <w:p>
+      <w:pPr>
+        <w:pStyle w:val="Heading1"/>
+      </w:pPr>
+      <w:r>
+        <w:t xml:space="preserve">What to watch</w:t>
+      </w:r>
+    </w:p>
+    <w:p>
+      <w:r>
+        <w:t xml:space="preserve">The next signs will be practical ones: a named site or operator for the AMRAAM facility, a contract or budget line, the outcome of the next </w:t>
+      </w:r>
+      <w:hyperlink r:id="rId13">
+        <w:r>
+          <w:rPr>
+            <w:rStyle w:val="Hyperlink"/>
+          </w:rPr>
+          <w:t xml:space="preserve">DICAS plenary</w:t>
+        </w:r>
+      </w:hyperlink>
+      <w:r>
+        <w:t xml:space="preserve">, and evidence that SM-3 technical data is moving under the </w:t>
+      </w:r>
+      <w:hyperlink r:id="rId10">
+        <w:r>
+          <w:rPr>
+            <w:rStyle w:val="Hyperlink"/>
+          </w:rPr>
+          <w:t xml:space="preserve">October agreement</w:t>
+        </w:r>
+      </w:hyperlink>
+      <w:r>
+        <w:t xml:space="preserve">. On the Philippine side, the markers are a decommissioning date for the first Abukuma-class destroyer and the start of </w:t>
+      </w:r>
       <w:hyperlink r:id="rId15">
-        <w:r>
-          <w:rPr>
-            <w:rStyle w:val="Hyperlink"/>
-          </w:rPr>
-          <w:t xml:space="preserve">The Japanese-language text</w:t>
-        </w:r>
-      </w:hyperlink>
-      <w:r>
-        <w:t xml:space="preserve"> is more guarded than the English: it presents the destroyer aim as a matter on which the two sides will continue consultations (協議を継続).</w:t>
-      </w:r>
-    </w:p>
-    <w:p>
-      <w:r>
-        <w:t xml:space="preserve">Much of this predates the week. When the two ministers met in Singapore on 31 May, they </w:t>
-      </w:r>
-      <w:hyperlink r:id="rId16">
-        <w:r>
-          <w:rPr>
-            <w:rStyle w:val="Hyperlink"/>
-          </w:rPr>
-          <w:t xml:space="preserve">reached a broad consensus</w:t>
-        </w:r>
-      </w:hyperlink>
-      <w:r>
-        <w:t xml:space="preserve"> to proceed with discussions toward transferring the destroyers promptly after decommissioning and one TC-90 within fiscal 2027, with training and maintenance to be worked out in a working group formed on 5 May. October’s increment is a stated aim for the first ship, training that begins before the handover and a move to coordination inside each government. No destroyer has been decommissioned or transferred. The Philippine arrangement and the missile decisions came on the same trip, but the published summaries do not link them.</w:t>
-      </w:r>
-    </w:p>
-    <w:p>
-      <w:pPr>
-        <w:pStyle w:val="Heading1"/>
-      </w:pPr>
-      <w:r>
-        <w:t xml:space="preserve">What to watch</w:t>
-      </w:r>
-    </w:p>
-    <w:p>
-      <w:r>
-        <w:t xml:space="preserve">The next signs will be practical ones: a named site or operator for the AMRAAM facility, a contract or budget line, the outcome of the next </w:t>
-      </w:r>
-      <w:hyperlink r:id="rId12">
-        <w:r>
-          <w:rPr>
-            <w:rStyle w:val="Hyperlink"/>
-          </w:rPr>
-          <w:t xml:space="preserve">DICAS plenary</w:t>
-        </w:r>
-      </w:hyperlink>
-      <w:r>
-        <w:t xml:space="preserve">, and evidence that SM-3 technical data is moving under the </w:t>
-      </w:r>
-      <w:hyperlink r:id="rId10">
-        <w:r>
-          <w:rPr>
-            <w:rStyle w:val="Hyperlink"/>
-          </w:rPr>
-          <w:t xml:space="preserve">October agreement</w:t>
-        </w:r>
-      </w:hyperlink>
-      <w:r>
-        <w:t xml:space="preserve">. On the Philippine side, the markers are a decommissioning date for the first Abukuma-class destroyer and the start of </w:t>
-      </w:r>
-      <w:hyperlink r:id="rId14">
         <w:r>
           <w:rPr>
             <w:rStyle w:val="Hyperlink"/>

</xml_diff>